<commit_message>
Remove unnecessary chunk from se data download post
</commit_message>
<xml_diff>
--- a/docs/posts/socioeconomic-demo/index.docx
+++ b/docs/posts/socioeconomic-demo/index.docx
@@ -60,272 +60,6 @@
         </w:p>
       </w:sdtContent>
     </w:sdt>
-    <w:p>
-      <w:pPr>
-        <w:pStyle w:val="SourceCode"/>
-      </w:pPr>
-      <w:r>
-        <w:rPr>
-          <w:rStyle w:val="CommentTok"/>
-        </w:rPr>
-        <w:t xml:space="preserve"># Add this to your reticulate setup section</w:t>
-      </w:r>
-      <w:r>
-        <w:br/>
-      </w:r>
-      <w:r>
-        <w:rPr>
-          <w:rStyle w:val="FunctionTok"/>
-        </w:rPr>
-        <w:t xml:space="preserve">library</w:t>
-      </w:r>
-      <w:r>
-        <w:rPr>
-          <w:rStyle w:val="NormalTok"/>
-        </w:rPr>
-        <w:t xml:space="preserve">(reticulate)</w:t>
-      </w:r>
-      <w:r>
-        <w:br/>
-      </w:r>
-      <w:r>
-        <w:rPr>
-          <w:rStyle w:val="NormalTok"/>
-        </w:rPr>
-        <w:t xml:space="preserve">reticulate</w:t>
-      </w:r>
-      <w:r>
-        <w:rPr>
-          <w:rStyle w:val="SpecialCharTok"/>
-        </w:rPr>
-        <w:t xml:space="preserve">::</w:t>
-      </w:r>
-      <w:r>
-        <w:rPr>
-          <w:rStyle w:val="FunctionTok"/>
-        </w:rPr>
-        <w:t xml:space="preserve">use_condaenv</w:t>
-      </w:r>
-      <w:r>
-        <w:rPr>
-          <w:rStyle w:val="NormalTok"/>
-        </w:rPr>
-        <w:t xml:space="preserve">(</w:t>
-      </w:r>
-      <w:r>
-        <w:rPr>
-          <w:rStyle w:val="StringTok"/>
-        </w:rPr>
-        <w:t xml:space="preserve">"metro"</w:t>
-      </w:r>
-      <w:r>
-        <w:rPr>
-          <w:rStyle w:val="NormalTok"/>
-        </w:rPr>
-        <w:t xml:space="preserve">, </w:t>
-      </w:r>
-      <w:r>
-        <w:rPr>
-          <w:rStyle w:val="AttributeTok"/>
-        </w:rPr>
-        <w:t xml:space="preserve">required =</w:t>
-      </w:r>
-      <w:r>
-        <w:rPr>
-          <w:rStyle w:val="NormalTok"/>
-        </w:rPr>
-        <w:t xml:space="preserve"> </w:t>
-      </w:r>
-      <w:r>
-        <w:rPr>
-          <w:rStyle w:val="ConstantTok"/>
-        </w:rPr>
-        <w:t xml:space="preserve">TRUE</w:t>
-      </w:r>
-      <w:r>
-        <w:rPr>
-          <w:rStyle w:val="NormalTok"/>
-        </w:rPr>
-        <w:t xml:space="preserve">)</w:t>
-      </w:r>
-      <w:r>
-        <w:br/>
-      </w:r>
-      <w:r>
-        <w:br/>
-      </w:r>
-      <w:r>
-        <w:rPr>
-          <w:rStyle w:val="CommentTok"/>
-        </w:rPr>
-        <w:t xml:space="preserve"># Check which Python is being used</w:t>
-      </w:r>
-      <w:r>
-        <w:br/>
-      </w:r>
-      <w:r>
-        <w:rPr>
-          <w:rStyle w:val="NormalTok"/>
-        </w:rPr>
-        <w:t xml:space="preserve">reticulate</w:t>
-      </w:r>
-      <w:r>
-        <w:rPr>
-          <w:rStyle w:val="SpecialCharTok"/>
-        </w:rPr>
-        <w:t xml:space="preserve">::</w:t>
-      </w:r>
-      <w:r>
-        <w:rPr>
-          <w:rStyle w:val="FunctionTok"/>
-        </w:rPr>
-        <w:t xml:space="preserve">py_config</w:t>
-      </w:r>
-      <w:r>
-        <w:rPr>
-          <w:rStyle w:val="NormalTok"/>
-        </w:rPr>
-        <w:t xml:space="preserve">()</w:t>
-      </w:r>
-    </w:p>
-    <w:p>
-      <w:pPr>
-        <w:pStyle w:val="SourceCode"/>
-      </w:pPr>
-      <w:r>
-        <w:rPr>
-          <w:rStyle w:val="VerbatimChar"/>
-        </w:rPr>
-        <w:t xml:space="preserve">python:         C:/Users/pukar/.conda/envs/metro/python.exe</w:t>
-      </w:r>
-      <w:r>
-        <w:br/>
-      </w:r>
-      <w:r>
-        <w:rPr>
-          <w:rStyle w:val="VerbatimChar"/>
-        </w:rPr>
-        <w:t xml:space="preserve">libpython:      C:/Users/pukar/.conda/envs/metro/python313.dll</w:t>
-      </w:r>
-      <w:r>
-        <w:br/>
-      </w:r>
-      <w:r>
-        <w:rPr>
-          <w:rStyle w:val="VerbatimChar"/>
-        </w:rPr>
-        <w:t xml:space="preserve">pythonhome:     C:/Users/pukar/.conda/envs/metro</w:t>
-      </w:r>
-      <w:r>
-        <w:br/>
-      </w:r>
-      <w:r>
-        <w:rPr>
-          <w:rStyle w:val="VerbatimChar"/>
-        </w:rPr>
-        <w:t xml:space="preserve">version:        3.13.1 | packaged by Anaconda, Inc. | (main, Dec 11 2024, 17:02:46) [MSC v.1929 64 bit (AMD64)]</w:t>
-      </w:r>
-      <w:r>
-        <w:br/>
-      </w:r>
-      <w:r>
-        <w:rPr>
-          <w:rStyle w:val="VerbatimChar"/>
-        </w:rPr>
-        <w:t xml:space="preserve">Architecture:   64bit</w:t>
-      </w:r>
-      <w:r>
-        <w:br/>
-      </w:r>
-      <w:r>
-        <w:rPr>
-          <w:rStyle w:val="VerbatimChar"/>
-        </w:rPr>
-        <w:t xml:space="preserve">numpy:          C:/Users/pukar/.conda/envs/metro/Lib/site-packages/numpy</w:t>
-      </w:r>
-      <w:r>
-        <w:br/>
-      </w:r>
-      <w:r>
-        <w:rPr>
-          <w:rStyle w:val="VerbatimChar"/>
-        </w:rPr>
-        <w:t xml:space="preserve">numpy_version:  2.3.1</w:t>
-      </w:r>
-      <w:r>
-        <w:br/>
-      </w:r>
-      <w:r>
-        <w:br/>
-      </w:r>
-      <w:r>
-        <w:rPr>
-          <w:rStyle w:val="VerbatimChar"/>
-        </w:rPr>
-        <w:t xml:space="preserve">NOTE: Python version was forced by use_python() function</w:t>
-      </w:r>
-    </w:p>
-    <w:p>
-      <w:pPr>
-        <w:pStyle w:val="SourceCode"/>
-      </w:pPr>
-      <w:r>
-        <w:rPr>
-          <w:rStyle w:val="CommentTok"/>
-        </w:rPr>
-        <w:t xml:space="preserve"># Test if packages can be imported</w:t>
-      </w:r>
-      <w:r>
-        <w:br/>
-      </w:r>
-      <w:r>
-        <w:rPr>
-          <w:rStyle w:val="NormalTok"/>
-        </w:rPr>
-        <w:t xml:space="preserve">reticulate</w:t>
-      </w:r>
-      <w:r>
-        <w:rPr>
-          <w:rStyle w:val="SpecialCharTok"/>
-        </w:rPr>
-        <w:t xml:space="preserve">::</w:t>
-      </w:r>
-      <w:r>
-        <w:rPr>
-          <w:rStyle w:val="FunctionTok"/>
-        </w:rPr>
-        <w:t xml:space="preserve">py_run_string</w:t>
-      </w:r>
-      <w:r>
-        <w:rPr>
-          <w:rStyle w:val="NormalTok"/>
-        </w:rPr>
-        <w:t xml:space="preserve">(</w:t>
-      </w:r>
-      <w:r>
-        <w:rPr>
-          <w:rStyle w:val="StringTok"/>
-        </w:rPr>
-        <w:t xml:space="preserve">"import folium, matplotlib, mapclassify; print('All packages imported successfully')"</w:t>
-      </w:r>
-      <w:r>
-        <w:rPr>
-          <w:rStyle w:val="NormalTok"/>
-        </w:rPr>
-        <w:t xml:space="preserve">)</w:t>
-      </w:r>
-    </w:p>
-    <w:p>
-      <w:pPr>
-        <w:pStyle w:val="SourceCode"/>
-      </w:pPr>
-      <w:r>
-        <w:rPr>
-          <w:rStyle w:val="VerbatimChar"/>
-        </w:rPr>
-        <w:t xml:space="preserve">All packages imported successfully</w:t>
-      </w:r>
-    </w:p>
     <w:bookmarkStart w:id="25" w:name="set-up-the-environment"/>
     <w:p>
       <w:pPr>

</xml_diff>